<commit_message>
restore tags in potvrda_clan5 master template for recalibration
Co-authored-by: Cursor <cursoragent@cursor.com>
</commit_message>
<xml_diff>
--- a/backend/master_templates/potvrda_clan5_master.docx
+++ b/backend/master_templates/potvrda_clan5_master.docx
@@ -23,7 +23,7 @@
         <w:rPr>
           <w:b w:val="0"/>
         </w:rPr>
-        <w:t xml:space="preserve">PIB: , MB: </w:t>
+        <w:t>PIB: {{ client.tax_id }}, MB: {{ client.registration_number }}</w:t>
       </w:r>
     </w:p>
     <w:p>
@@ -40,7 +40,7 @@
         <w:rPr>
           <w:b w:val="0"/>
         </w:rPr>
-        <w:t>Na osnovu člana 5. Pravilnika o programu, načinu i visini troškova polaganja stručnog ispita za obavljanje poslova bezbednosti i zdravlja na radu, poslodavac  izdaje:</w:t>
+        <w:t>Na osnovu člana 5. Pravilnika o programu, načinu i visini troškova polaganja stručnog ispita za obavljanje poslova bezbednosti i zdravlja na radu, poslodavac {{ client.name }} izdaje:</w:t>
       </w:r>
     </w:p>
     <w:p>
@@ -103,7 +103,7 @@
         <w:rPr>
           <w:b w:val="0"/>
         </w:rPr>
-        <w:t xml:space="preserve">Zaposleni: </w:t>
+        <w:t>Zaposleni: {{ employee.full_name }}</w:t>
       </w:r>
     </w:p>
     <w:p>
@@ -114,7 +114,7 @@
         <w:rPr>
           <w:b w:val="0"/>
         </w:rPr>
-        <w:t xml:space="preserve">Organizacija: </w:t>
+        <w:t>Organizacija: {{ client.name }}</w:t>
       </w:r>
     </w:p>
     <w:p>
@@ -125,7 +125,7 @@
         <w:rPr>
           <w:b w:val="0"/>
         </w:rPr>
-        <w:t xml:space="preserve">Mesto rođenja: </w:t>
+        <w:t>Mesto rođenja: {{ employee.place_of_birth }}</w:t>
       </w:r>
     </w:p>
     <w:p>
@@ -136,7 +136,7 @@
         <w:rPr>
           <w:b w:val="0"/>
         </w:rPr>
-        <w:t xml:space="preserve">Datum rođenja: </w:t>
+        <w:t>Datum rođenja: {{ employee.date_of_birth }}</w:t>
       </w:r>
     </w:p>
     <w:p>
@@ -147,7 +147,7 @@
         <w:rPr>
           <w:b w:val="0"/>
         </w:rPr>
-        <w:t xml:space="preserve">JMBG: </w:t>
+        <w:t>JMBG: {{ employee.national_id }}</w:t>
       </w:r>
     </w:p>
     <w:p>
@@ -158,7 +158,7 @@
         <w:rPr>
           <w:b w:val="0"/>
         </w:rPr>
-        <w:t xml:space="preserve">Vrsta obuke: </w:t>
+        <w:t>Vrsta obuke: {{ training.name }}</w:t>
       </w:r>
     </w:p>
     <w:p>
@@ -192,7 +192,7 @@
         <w:rPr>
           <w:b w:val="0"/>
         </w:rPr>
-        <w:t>Potvrda se izdaje dana  na lični zahtev zaposlenog i može se upotrebiti u sve zakonom predviđene svrhe.</w:t>
+        <w:t>Potvrda se izdaje dana {{ performed_at }} na lični zahtev zaposlenog i može se upotrebiti u sve zakonom predviđene svrhe.</w:t>
       </w:r>
     </w:p>
     <w:p>

</xml_diff>

<commit_message>
regenerate potvrda_clan5 placements with unique calibration markers
Co-authored-by: Cursor <cursoragent@cursor.com>
</commit_message>
<xml_diff>
--- a/backend/master_templates/potvrda_clan5_master.docx
+++ b/backend/master_templates/potvrda_clan5_master.docx
@@ -23,7 +23,7 @@
         <w:rPr>
           <w:b w:val="0"/>
         </w:rPr>
-        <w:t>PIB: {{ client.tax_id }}, MB: {{ client.registration_number }}</w:t>
+        <w:t xml:space="preserve">PIB: , MB: </w:t>
       </w:r>
     </w:p>
     <w:p>
@@ -40,7 +40,7 @@
         <w:rPr>
           <w:b w:val="0"/>
         </w:rPr>
-        <w:t>Na osnovu člana 5. Pravilnika o programu, načinu i visini troškova polaganja stručnog ispita za obavljanje poslova bezbednosti i zdravlja na radu, poslodavac {{ client.name }} izdaje:</w:t>
+        <w:t>Na osnovu člana 5. Pravilnika o programu, načinu i visini troškova polaganja stručnog ispita za obavljanje poslova bezbednosti i zdravlja na radu, poslodavac  izdaje:</w:t>
       </w:r>
     </w:p>
     <w:p>
@@ -103,7 +103,7 @@
         <w:rPr>
           <w:b w:val="0"/>
         </w:rPr>
-        <w:t>Zaposleni: {{ employee.full_name }}</w:t>
+        <w:t xml:space="preserve">Zaposleni: </w:t>
       </w:r>
     </w:p>
     <w:p>
@@ -114,7 +114,7 @@
         <w:rPr>
           <w:b w:val="0"/>
         </w:rPr>
-        <w:t>Organizacija: {{ client.name }}</w:t>
+        <w:t xml:space="preserve">Organizacija: </w:t>
       </w:r>
     </w:p>
     <w:p>
@@ -125,7 +125,7 @@
         <w:rPr>
           <w:b w:val="0"/>
         </w:rPr>
-        <w:t>Mesto rođenja: {{ employee.place_of_birth }}</w:t>
+        <w:t xml:space="preserve">Mesto rođenja: </w:t>
       </w:r>
     </w:p>
     <w:p>
@@ -136,7 +136,7 @@
         <w:rPr>
           <w:b w:val="0"/>
         </w:rPr>
-        <w:t>Datum rođenja: {{ employee.date_of_birth }}</w:t>
+        <w:t xml:space="preserve">Datum rođenja: </w:t>
       </w:r>
     </w:p>
     <w:p>
@@ -147,7 +147,7 @@
         <w:rPr>
           <w:b w:val="0"/>
         </w:rPr>
-        <w:t>JMBG: {{ employee.national_id }}</w:t>
+        <w:t xml:space="preserve">JMBG: </w:t>
       </w:r>
     </w:p>
     <w:p>
@@ -158,7 +158,7 @@
         <w:rPr>
           <w:b w:val="0"/>
         </w:rPr>
-        <w:t>Vrsta obuke: {{ training.name }}</w:t>
+        <w:t xml:space="preserve">Vrsta obuke: </w:t>
       </w:r>
     </w:p>
     <w:p>
@@ -192,7 +192,7 @@
         <w:rPr>
           <w:b w:val="0"/>
         </w:rPr>
-        <w:t>Potvrda se izdaje dana {{ performed_at }} na lični zahtev zaposlenog i može se upotrebiti u sve zakonom predviđene svrhe.</w:t>
+        <w:t>Potvrda se izdaje dana  na lični zahtev zaposlenog i može se upotrebiti u sve zakonom predviđene svrhe.</w:t>
       </w:r>
     </w:p>
     <w:p>

</xml_diff>

<commit_message>
fix: switch uput and potvrda clan5 master templates to DOCX_PLACEHOLDER mail-merge
VISUAL coordinate overlay can't handle prose lines with multiple inline
tags: real values vary in width, so they collide with adjacent tags and
following static text. Restore tags in the three affected master docx
files and drop them from placements.json so add_setup wires them back
to DOCX_PLACEHOLDER, matching every other master template.

Co-authored-by: Cursor <cursoragent@cursor.com>
</commit_message>
<xml_diff>
--- a/backend/master_templates/potvrda_clan5_master.docx
+++ b/backend/master_templates/potvrda_clan5_master.docx
@@ -23,7 +23,7 @@
         <w:rPr>
           <w:b w:val="0"/>
         </w:rPr>
-        <w:t xml:space="preserve">PIB: , MB: </w:t>
+        <w:t>PIB: {{ client.tax_id }}, MB: {{ client.registration_number }}</w:t>
       </w:r>
     </w:p>
     <w:p>
@@ -40,7 +40,7 @@
         <w:rPr>
           <w:b w:val="0"/>
         </w:rPr>
-        <w:t>Na osnovu člana 5. Pravilnika o programu, načinu i visini troškova polaganja stručnog ispita za obavljanje poslova bezbednosti i zdravlja na radu, poslodavac  izdaje:</w:t>
+        <w:t>Na osnovu člana 5. Pravilnika o programu, načinu i visini troškova polaganja stručnog ispita za obavljanje poslova bezbednosti i zdravlja na radu, poslodavac {{ client.name }} izdaje:</w:t>
       </w:r>
     </w:p>
     <w:p>
@@ -103,7 +103,7 @@
         <w:rPr>
           <w:b w:val="0"/>
         </w:rPr>
-        <w:t xml:space="preserve">Zaposleni: </w:t>
+        <w:t>Zaposleni: {{ employee.full_name }}</w:t>
       </w:r>
     </w:p>
     <w:p>
@@ -114,7 +114,7 @@
         <w:rPr>
           <w:b w:val="0"/>
         </w:rPr>
-        <w:t xml:space="preserve">Organizacija: </w:t>
+        <w:t>Organizacija: {{ client.name }}</w:t>
       </w:r>
     </w:p>
     <w:p>
@@ -125,7 +125,7 @@
         <w:rPr>
           <w:b w:val="0"/>
         </w:rPr>
-        <w:t xml:space="preserve">Mesto rođenja: </w:t>
+        <w:t>Mesto rođenja: {{ employee.place_of_birth }}</w:t>
       </w:r>
     </w:p>
     <w:p>
@@ -136,7 +136,7 @@
         <w:rPr>
           <w:b w:val="0"/>
         </w:rPr>
-        <w:t xml:space="preserve">Datum rođenja: </w:t>
+        <w:t>Datum rođenja: {{ employee.date_of_birth }}</w:t>
       </w:r>
     </w:p>
     <w:p>
@@ -147,7 +147,7 @@
         <w:rPr>
           <w:b w:val="0"/>
         </w:rPr>
-        <w:t xml:space="preserve">JMBG: </w:t>
+        <w:t>JMBG: {{ employee.national_id }}</w:t>
       </w:r>
     </w:p>
     <w:p>
@@ -158,7 +158,7 @@
         <w:rPr>
           <w:b w:val="0"/>
         </w:rPr>
-        <w:t xml:space="preserve">Vrsta obuke: </w:t>
+        <w:t>Vrsta obuke: {{ training.name }}</w:t>
       </w:r>
     </w:p>
     <w:p>
@@ -192,7 +192,7 @@
         <w:rPr>
           <w:b w:val="0"/>
         </w:rPr>
-        <w:t>Potvrda se izdaje dana  na lični zahtev zaposlenog i može se upotrebiti u sve zakonom predviđene svrhe.</w:t>
+        <w:t>Potvrda se izdaje dana {{ performed_at }} na lični zahtev zaposlenog i može se upotrebiti u sve zakonom predviđene svrhe.</w:t>
       </w:r>
     </w:p>
     <w:p>

</xml_diff>